<commit_message>
content: confirmed GCP-to-Azure outcome copy; remove Bicep from resume and comparison table
- case-studies: reword GCP-to-Azure outcome per owner
- resume: drop Bicep from summary, Terraform bullet, skills; rebuild .docx
- index: 'iac (native)' Azure cell Bicep / ARM -> ARM templates
</commit_message>
<xml_diff>
--- a/resume/Colin-Shanahan-Resume.docx
+++ b/resume/Colin-Shanahan-Resume.docx
@@ -48,7 +48,7 @@
         </w:rPr>
         <w:t xml:space="preserve">Portfolio: </w:t>
       </w:r>
-      <w:hyperlink w:history="1" r:id="rIdcmrfiuvqo2z4wta-jhojg">
+      <w:hyperlink w:history="1" r:id="rId5e5bb2pimlvb1mzt--eh6">
         <w:r>
           <w:rPr>
             <w:rFonts w:ascii="Calibri" w:cs="Calibri" w:eastAsia="Calibri" w:hAnsi="Calibri"/>
@@ -104,7 +104,7 @@
           <w:sz w:val="19"/>
           <w:szCs w:val="19"/>
         </w:rPr>
-        <w:t xml:space="preserve">DevOps engineer and cloud architect with 10+ years across infrastructure, systems, and cloud automation. Sole owner of the full Azure estate at RDGFilings – CI/CD architecture, IaC (Terraform-first, with Bicep experience), security posture, and cost governance – serving as the bridge between application teams and infrastructure. Certified in Azure administration and DevOps (AZ-104, AZ-400) with deep experience migrating legacy toolchains (Octopus Deploy, Jenkins) to modern, credential-free pipelines.</w:t>
+        <w:t xml:space="preserve">DevOps engineer and cloud architect with 10+ years across infrastructure, systems, and cloud automation. Sole owner of the full Azure estate at RDGFilings – CI/CD architecture, IaC (Terraform-first), security posture, and cost governance – serving as the bridge between application teams and infrastructure. Certified in Azure administration and DevOps (AZ-104, AZ-400) with deep experience migrating legacy toolchains (Octopus Deploy, Jenkins) to modern, credential-free pipelines.</w:t>
       </w:r>
     </w:p>
     <w:p>
@@ -293,7 +293,7 @@
           <w:sz w:val="19"/>
           <w:szCs w:val="19"/>
         </w:rPr>
-        <w:t xml:space="preserve"> (and Bicep) IaC to automate provisioning of Container Apps, Function Apps, VMs, Key Vault, and networking, replacing GCP-based systems with consistent, repeatable Azure deployments.</w:t>
+        <w:t xml:space="preserve"> IaC to automate provisioning of Container Apps, Function Apps, VMs, Key Vault, and networking, replacing GCP-based systems with consistent, repeatable Azure deployments.</w:t>
       </w:r>
     </w:p>
     <w:p>
@@ -1041,7 +1041,7 @@
           <w:sz w:val="19"/>
           <w:szCs w:val="19"/>
         </w:rPr>
-        <w:t xml:space="preserve"> Azure (Container Apps, Function Apps, Key Vault, Static Web Apps, App Insights/KQL), AWS, GCP • Terraform • Bicep • CloudFormation</w:t>
+        <w:t xml:space="preserve"> Azure (Container Apps, Function Apps, Key Vault, Static Web Apps, App Insights/KQL), AWS, GCP • Terraform • CloudFormation</w:t>
       </w:r>
     </w:p>
     <w:p>
@@ -1086,10 +1086,6 @@
 </w:document>
 </file>
 
-<file path=word/comments.xml><?xml version="1.0" encoding="utf-8"?>
-<w:comments xmlns:cx="http://schemas.microsoft.com/office/drawing/2014/chartex" xmlns:cx1="http://schemas.microsoft.com/office/drawing/2015/9/8/chartex" xmlns:cx2="http://schemas.microsoft.com/office/drawing/2015/10/21/chartex" xmlns:cx3="http://schemas.microsoft.com/office/drawing/2016/5/9/chartex" xmlns:cx4="http://schemas.microsoft.com/office/drawing/2016/5/10/chartex" xmlns:cx5="http://schemas.microsoft.com/office/drawing/2016/5/11/chartex" xmlns:cx6="http://schemas.microsoft.com/office/drawing/2016/5/12/chartex" xmlns:cx7="http://schemas.microsoft.com/office/drawing/2016/5/13/chartex" xmlns:cx8="http://schemas.microsoft.com/office/drawing/2016/5/14/chartex" xmlns:mc="http://schemas.openxmlformats.org/markup-compatibility/2006" xmlns:aink="http://schemas.microsoft.com/office/drawing/2016/ink" xmlns:am3d="http://schemas.microsoft.com/office/drawing/2017/model3d" xmlns:o="urn:schemas-microsoft-com:office:office" xmlns:r="http://schemas.openxmlformats.org/officeDocument/2006/relationships" xmlns:m="http://schemas.openxmlformats.org/officeDocument/2006/math" xmlns:v="urn:schemas-microsoft-com:vml" xmlns:wp14="http://schemas.microsoft.com/office/word/2010/wordprocessingDrawing" xmlns:wp="http://schemas.openxmlformats.org/drawingml/2006/wordprocessingDrawing" xmlns:w10="urn:schemas-microsoft-com:office:word" xmlns:w="http://schemas.openxmlformats.org/wordprocessingml/2006/main" xmlns:w14="http://schemas.microsoft.com/office/word/2010/wordml" xmlns:w15="http://schemas.microsoft.com/office/word/2012/wordml" xmlns:w16cex="http://schemas.microsoft.com/office/word/2018/wordml/cex" xmlns:w16cid="http://schemas.microsoft.com/office/word/2016/wordml/cid" xmlns:w16="http://schemas.microsoft.com/office/word/2018/wordml" xmlns:w16sdtdh="http://schemas.microsoft.com/office/word/2020/wordml/sdtdatahash" xmlns:w16se="http://schemas.microsoft.com/office/word/2015/wordml/symex" xmlns:wpg="http://schemas.microsoft.com/office/word/2010/wordprocessingGroup" xmlns:wpi="http://schemas.microsoft.com/office/word/2010/wordprocessingInk" xmlns:wne="http://schemas.microsoft.com/office/word/2006/wordml" xmlns:wps="http://schemas.microsoft.com/office/word/2010/wordprocessingShape"/>
-</file>
-
 <file path=word/endnotes.xml><?xml version="1.0" encoding="utf-8"?>
 <w:endnotes xmlns:wpc="http://schemas.microsoft.com/office/word/2010/wordprocessingCanvas" xmlns:mc="http://schemas.openxmlformats.org/markup-compatibility/2006" xmlns:o="urn:schemas-microsoft-com:office:office" xmlns:r="http://schemas.openxmlformats.org/officeDocument/2006/relationships" xmlns:m="http://schemas.openxmlformats.org/officeDocument/2006/math" xmlns:v="urn:schemas-microsoft-com:vml" xmlns:wp14="http://schemas.microsoft.com/office/word/2010/wordprocessingDrawing" xmlns:wp="http://schemas.openxmlformats.org/drawingml/2006/wordprocessingDrawing" xmlns:w10="urn:schemas-microsoft-com:office:word" xmlns:w="http://schemas.openxmlformats.org/wordprocessingml/2006/main" xmlns:w14="http://schemas.microsoft.com/office/word/2010/wordml" xmlns:w15="http://schemas.microsoft.com/office/word/2012/wordml" xmlns:wpg="http://schemas.microsoft.com/office/word/2010/wordprocessingGroup" xmlns:wpi="http://schemas.microsoft.com/office/word/2010/wordprocessingInk" xmlns:wne="http://schemas.microsoft.com/office/word/2006/wordml" xmlns:wps="http://schemas.microsoft.com/office/word/2010/wordprocessingShape" mc:Ignorable="w14 w15 wp14">
   <w:endnote w:type="separator" w:id="-1">
@@ -1168,7 +1164,7 @@
 <w:numbering xmlns:wpc="http://schemas.microsoft.com/office/word/2010/wordprocessingCanvas" xmlns:mc="http://schemas.openxmlformats.org/markup-compatibility/2006" xmlns:o="urn:schemas-microsoft-com:office:office" xmlns:r="http://schemas.openxmlformats.org/officeDocument/2006/relationships" xmlns:m="http://schemas.openxmlformats.org/officeDocument/2006/math" xmlns:v="urn:schemas-microsoft-com:vml" xmlns:wp14="http://schemas.microsoft.com/office/word/2010/wordprocessingDrawing" xmlns:wp="http://schemas.openxmlformats.org/drawingml/2006/wordprocessingDrawing" xmlns:w10="urn:schemas-microsoft-com:office:word" xmlns:w="http://schemas.openxmlformats.org/wordprocessingml/2006/main" xmlns:w14="http://schemas.microsoft.com/office/word/2010/wordml" xmlns:w15="http://schemas.microsoft.com/office/word/2012/wordml" xmlns:wpg="http://schemas.microsoft.com/office/word/2010/wordprocessingGroup" xmlns:wpi="http://schemas.microsoft.com/office/word/2010/wordprocessingInk" xmlns:wne="http://schemas.microsoft.com/office/word/2006/wordml" xmlns:wps="http://schemas.microsoft.com/office/word/2010/wordprocessingShape" mc:Ignorable="w14 w15 wp14">
   <w:abstractNum w:abstractNumId="1" w15:restartNumberingAfterBreak="0">
     <w:multiLevelType w:val="hybridMultilevel"/>
-    <w:lvl w:ilvl="0" w15:tentative="1">
+    <w:lvl w:ilvl="0" w:tentative="1">
       <w:start w:val="1"/>
       <w:numFmt w:val="bullet"/>
       <w:lvlText w:val="●"/>
@@ -1177,7 +1173,7 @@
         <w:ind w:left="720" w:hanging="360"/>
       </w:pPr>
     </w:lvl>
-    <w:lvl w:ilvl="1" w15:tentative="1">
+    <w:lvl w:ilvl="1" w:tentative="1">
       <w:start w:val="1"/>
       <w:numFmt w:val="bullet"/>
       <w:lvlText w:val="○"/>
@@ -1186,7 +1182,7 @@
         <w:ind w:left="1440" w:hanging="360"/>
       </w:pPr>
     </w:lvl>
-    <w:lvl w:ilvl="2" w15:tentative="1">
+    <w:lvl w:ilvl="2" w:tentative="1">
       <w:start w:val="1"/>
       <w:numFmt w:val="bullet"/>
       <w:lvlText w:val="■"/>
@@ -1195,7 +1191,7 @@
         <w:ind w:left="2160" w:hanging="360"/>
       </w:pPr>
     </w:lvl>
-    <w:lvl w:ilvl="3" w15:tentative="1">
+    <w:lvl w:ilvl="3" w:tentative="1">
       <w:start w:val="1"/>
       <w:numFmt w:val="bullet"/>
       <w:lvlText w:val="●"/>
@@ -1204,7 +1200,7 @@
         <w:ind w:left="2880" w:hanging="360"/>
       </w:pPr>
     </w:lvl>
-    <w:lvl w:ilvl="4" w15:tentative="1">
+    <w:lvl w:ilvl="4" w:tentative="1">
       <w:start w:val="1"/>
       <w:numFmt w:val="bullet"/>
       <w:lvlText w:val="○"/>
@@ -1213,7 +1209,7 @@
         <w:ind w:left="3600" w:hanging="360"/>
       </w:pPr>
     </w:lvl>
-    <w:lvl w:ilvl="5" w15:tentative="1">
+    <w:lvl w:ilvl="5" w:tentative="1">
       <w:start w:val="1"/>
       <w:numFmt w:val="bullet"/>
       <w:lvlText w:val="■"/>
@@ -1222,7 +1218,7 @@
         <w:ind w:left="4320" w:hanging="360"/>
       </w:pPr>
     </w:lvl>
-    <w:lvl w:ilvl="6" w15:tentative="1">
+    <w:lvl w:ilvl="6" w:tentative="1">
       <w:start w:val="1"/>
       <w:numFmt w:val="bullet"/>
       <w:lvlText w:val="●"/>
@@ -1231,7 +1227,7 @@
         <w:ind w:left="5040" w:hanging="360"/>
       </w:pPr>
     </w:lvl>
-    <w:lvl w:ilvl="7" w15:tentative="1">
+    <w:lvl w:ilvl="7" w:tentative="1">
       <w:start w:val="1"/>
       <w:numFmt w:val="bullet"/>
       <w:lvlText w:val="●"/>
@@ -1240,7 +1236,7 @@
         <w:ind w:left="5760" w:hanging="360"/>
       </w:pPr>
     </w:lvl>
-    <w:lvl w:ilvl="8" w15:tentative="1">
+    <w:lvl w:ilvl="8" w:tentative="1">
       <w:start w:val="1"/>
       <w:numFmt w:val="bullet"/>
       <w:lvlText w:val="●"/>
@@ -1252,7 +1248,7 @@
   </w:abstractNum>
   <w:abstractNum w:abstractNumId="2" w15:restartNumberingAfterBreak="0">
     <w:multiLevelType w:val="hybridMultilevel"/>
-    <w:lvl w:ilvl="0" w15:tentative="1">
+    <w:lvl w:ilvl="0" w:tentative="1">
       <w:start w:val="1"/>
       <w:numFmt w:val="bullet"/>
       <w:lvlText w:val="•"/>
@@ -1283,6 +1279,10 @@
     <w:rPrDefault/>
     <w:pPrDefault/>
   </w:docDefaults>
+  <w:style w:type="paragraph" w:styleId="Normal" w:default="1">
+    <w:name w:val="Normal"/>
+    <w:qFormat/>
+  </w:style>
   <w:style w:type="paragraph" w:styleId="Title">
     <w:name w:val="Title"/>
     <w:basedOn w:val="Normal"/>
@@ -1455,4 +1455,294 @@
     </w:rPr>
   </w:style>
 </w:styles>
+</file>
+
+<file path=word/theme/theme1.xml><?xml version="1.0" encoding="utf-8"?>
+<a:theme xmlns:a="http://schemas.openxmlformats.org/drawingml/2006/main" name="Office Theme">
+  <a:themeElements>
+    <a:clrScheme name="Office">
+      <a:dk1>
+        <a:sysClr val="windowText" lastClr="000000"/>
+      </a:dk1>
+      <a:lt1>
+        <a:sysClr val="window" lastClr="FFFFFF"/>
+      </a:lt1>
+      <a:dk2>
+        <a:srgbClr val="44546A"/>
+      </a:dk2>
+      <a:lt2>
+        <a:srgbClr val="E7E6E6"/>
+      </a:lt2>
+      <a:accent1>
+        <a:srgbClr val="4472C4"/>
+      </a:accent1>
+      <a:accent2>
+        <a:srgbClr val="ED7D31"/>
+      </a:accent2>
+      <a:accent3>
+        <a:srgbClr val="A5A5A5"/>
+      </a:accent3>
+      <a:accent4>
+        <a:srgbClr val="FFC000"/>
+      </a:accent4>
+      <a:accent5>
+        <a:srgbClr val="5B9BD5"/>
+      </a:accent5>
+      <a:accent6>
+        <a:srgbClr val="70AD47"/>
+      </a:accent6>
+      <a:hlink>
+        <a:srgbClr val="0563C1"/>
+      </a:hlink>
+      <a:folHlink>
+        <a:srgbClr val="954F72"/>
+      </a:folHlink>
+    </a:clrScheme>
+    <a:fontScheme name="Office">
+      <a:majorFont>
+        <a:latin typeface="Calibri Light" panose="020F0302020204030204"/>
+        <a:ea typeface=""/>
+        <a:cs typeface=""/>
+        <a:font script="Jpan" typeface="游ゴシック Light"/>
+        <a:font script="Hang" typeface="맑은 고딕"/>
+        <a:font script="Hans" typeface="等线 Light"/>
+        <a:font script="Hant" typeface="新細明體"/>
+        <a:font script="Arab" typeface="Times New Roman"/>
+        <a:font script="Hebr" typeface="Times New Roman"/>
+        <a:font script="Thai" typeface="Angsana New"/>
+        <a:font script="Ethi" typeface="Nyala"/>
+        <a:font script="Beng" typeface="Vrinda"/>
+        <a:font script="Gujr" typeface="Shruti"/>
+        <a:font script="Khmr" typeface="MoolBoran"/>
+        <a:font script="Knda" typeface="Tunga"/>
+        <a:font script="Guru" typeface="Raavi"/>
+        <a:font script="Cans" typeface="Euphemia"/>
+        <a:font script="Cher" typeface="Plantagenet Cherokee"/>
+        <a:font script="Yiii" typeface="Microsoft Yi Baiti"/>
+        <a:font script="Tibt" typeface="Microsoft Himalaya"/>
+        <a:font script="Thaa" typeface="MV Boli"/>
+        <a:font script="Deva" typeface="Mangal"/>
+        <a:font script="Telu" typeface="Gautami"/>
+        <a:font script="Taml" typeface="Latha"/>
+        <a:font script="Syrc" typeface="Estrangelo Edessa"/>
+        <a:font script="Orya" typeface="Kalinga"/>
+        <a:font script="Mlym" typeface="Kartika"/>
+        <a:font script="Laoo" typeface="DokChampa"/>
+        <a:font script="Sinh" typeface="Iskoola Pota"/>
+        <a:font script="Mong" typeface="Mongolian Baiti"/>
+        <a:font script="Viet" typeface="Times New Roman"/>
+        <a:font script="Uigh" typeface="Microsoft Uighur"/>
+        <a:font script="Geor" typeface="Sylfaen"/>
+        <a:font script="Armn" typeface="Arial"/>
+        <a:font script="Bugi" typeface="Leelawadee UI"/>
+        <a:font script="Bopo" typeface="Microsoft JhengHei"/>
+        <a:font script="Java" typeface="Javanese Text"/>
+        <a:font script="Lisu" typeface="Segoe UI"/>
+        <a:font script="Mymr" typeface="Myanmar Text"/>
+        <a:font script="Nkoo" typeface="Ebrima"/>
+        <a:font script="Olck" typeface="Nirmala UI"/>
+        <a:font script="Osma" typeface="Ebrima"/>
+        <a:font script="Phag" typeface="Phagspa"/>
+        <a:font script="Syrn" typeface="Estrangelo Edessa"/>
+        <a:font script="Syrj" typeface="Estrangelo Edessa"/>
+        <a:font script="Syre" typeface="Estrangelo Edessa"/>
+        <a:font script="Sora" typeface="Nirmala UI"/>
+        <a:font script="Tale" typeface="Microsoft Tai Le"/>
+        <a:font script="Talu" typeface="Microsoft New Tai Lue"/>
+        <a:font script="Tfng" typeface="Ebrima"/>
+      </a:majorFont>
+      <a:minorFont>
+        <a:latin typeface="Calibri" panose="020F0502020204030204"/>
+        <a:ea typeface=""/>
+        <a:cs typeface=""/>
+        <a:font script="Jpan" typeface="游明朝"/>
+        <a:font script="Hang" typeface="맑은 고딕"/>
+        <a:font script="Hans" typeface="等线"/>
+        <a:font script="Hant" typeface="新細明體"/>
+        <a:font script="Arab" typeface="Arial"/>
+        <a:font script="Hebr" typeface="Arial"/>
+        <a:font script="Thai" typeface="Cordia New"/>
+        <a:font script="Ethi" typeface="Nyala"/>
+        <a:font script="Beng" typeface="Vrinda"/>
+        <a:font script="Gujr" typeface="Shruti"/>
+        <a:font script="Khmr" typeface="DaunPenh"/>
+        <a:font script="Knda" typeface="Tunga"/>
+        <a:font script="Guru" typeface="Raavi"/>
+        <a:font script="Cans" typeface="Euphemia"/>
+        <a:font script="Cher" typeface="Plantagenet Cherokee"/>
+        <a:font script="Yiii" typeface="Microsoft Yi Baiti"/>
+        <a:font script="Tibt" typeface="Microsoft Himalaya"/>
+        <a:font script="Thaa" typeface="MV Boli"/>
+        <a:font script="Deva" typeface="Mangal"/>
+        <a:font script="Telu" typeface="Gautami"/>
+        <a:font script="Taml" typeface="Latha"/>
+        <a:font script="Syrc" typeface="Estrangelo Edessa"/>
+        <a:font script="Orya" typeface="Kalinga"/>
+        <a:font script="Mlym" typeface="Kartika"/>
+        <a:font script="Laoo" typeface="DokChampa"/>
+        <a:font script="Sinh" typeface="Iskoola Pota"/>
+        <a:font script="Mong" typeface="Mongolian Baiti"/>
+        <a:font script="Viet" typeface="Arial"/>
+        <a:font script="Uigh" typeface="Microsoft Uighur"/>
+        <a:font script="Geor" typeface="Sylfaen"/>
+        <a:font script="Armn" typeface="Arial"/>
+        <a:font script="Bugi" typeface="Leelawadee UI"/>
+        <a:font script="Bopo" typeface="Microsoft JhengHei"/>
+        <a:font script="Java" typeface="Javanese Text"/>
+        <a:font script="Lisu" typeface="Segoe UI"/>
+        <a:font script="Mymr" typeface="Myanmar Text"/>
+        <a:font script="Nkoo" typeface="Ebrima"/>
+        <a:font script="Olck" typeface="Nirmala UI"/>
+        <a:font script="Osma" typeface="Ebrima"/>
+        <a:font script="Phag" typeface="Phagspa"/>
+        <a:font script="Syrn" typeface="Estrangelo Edessa"/>
+        <a:font script="Syrj" typeface="Estrangelo Edessa"/>
+        <a:font script="Syre" typeface="Estrangelo Edessa"/>
+        <a:font script="Sora" typeface="Nirmala UI"/>
+        <a:font script="Tale" typeface="Microsoft Tai Le"/>
+        <a:font script="Talu" typeface="Microsoft New Tai Lue"/>
+        <a:font script="Tfng" typeface="Ebrima"/>
+      </a:minorFont>
+    </a:fontScheme>
+    <a:fmtScheme name="Office">
+      <a:fillStyleLst>
+        <a:solidFill>
+          <a:schemeClr val="phClr"/>
+        </a:solidFill>
+        <a:gradFill rotWithShape="true">
+          <a:gsLst>
+            <a:gs pos="0">
+              <a:schemeClr val="phClr">
+                <a:lumMod val="110000"/>
+                <a:satMod val="105000"/>
+                <a:tint val="67000"/>
+              </a:schemeClr>
+            </a:gs>
+            <a:gs pos="50000">
+              <a:schemeClr val="phClr">
+                <a:lumMod val="105000"/>
+                <a:satMod val="103000"/>
+                <a:tint val="73000"/>
+              </a:schemeClr>
+            </a:gs>
+            <a:gs pos="100000">
+              <a:schemeClr val="phClr">
+                <a:lumMod val="105000"/>
+                <a:satMod val="109000"/>
+                <a:tint val="81000"/>
+              </a:schemeClr>
+            </a:gs>
+          </a:gsLst>
+          <a:lin ang="5400000" scaled="false"/>
+        </a:gradFill>
+        <a:gradFill rotWithShape="true">
+          <a:gsLst>
+            <a:gs pos="0">
+              <a:schemeClr val="phClr">
+                <a:satMod val="103000"/>
+                <a:lumMod val="102000"/>
+                <a:tint val="94000"/>
+              </a:schemeClr>
+            </a:gs>
+            <a:gs pos="50000">
+              <a:schemeClr val="phClr">
+                <a:satMod val="110000"/>
+                <a:lumMod val="100000"/>
+                <a:shade val="100000"/>
+              </a:schemeClr>
+            </a:gs>
+            <a:gs pos="100000">
+              <a:schemeClr val="phClr">
+                <a:lumMod val="99000"/>
+                <a:satMod val="120000"/>
+                <a:shade val="78000"/>
+              </a:schemeClr>
+            </a:gs>
+          </a:gsLst>
+          <a:lin ang="5400000" scaled="false"/>
+        </a:gradFill>
+      </a:fillStyleLst>
+      <a:lnStyleLst>
+        <a:ln w="6350" cap="flat" cmpd="sng" algn="ctr">
+          <a:solidFill>
+            <a:schemeClr val="phClr"/>
+          </a:solidFill>
+          <a:prstDash val="solid"/>
+          <a:miter lim="800000"/>
+        </a:ln>
+        <a:ln w="12700" cap="flat" cmpd="sng" algn="ctr">
+          <a:solidFill>
+            <a:schemeClr val="phClr"/>
+          </a:solidFill>
+          <a:prstDash val="solid"/>
+          <a:miter lim="800000"/>
+        </a:ln>
+        <a:ln w="19050" cap="flat" cmpd="sng" algn="ctr">
+          <a:solidFill>
+            <a:schemeClr val="phClr"/>
+          </a:solidFill>
+          <a:prstDash val="solid"/>
+          <a:miter lim="800000"/>
+        </a:ln>
+      </a:lnStyleLst>
+      <a:effectStyleLst>
+        <a:effectStyle>
+          <a:effectLst/>
+        </a:effectStyle>
+        <a:effectStyle>
+          <a:effectLst/>
+        </a:effectStyle>
+        <a:effectStyle>
+          <a:effectLst>
+            <a:outerShdw blurRad="57150" dist="19050" dir="5400000" algn="ctr" rotWithShape="false">
+              <a:srgbClr val="000000">
+                <a:alpha val="63000"/>
+              </a:srgbClr>
+            </a:outerShdw>
+          </a:effectLst>
+        </a:effectStyle>
+      </a:effectStyleLst>
+      <a:bgFillStyleLst>
+        <a:solidFill>
+          <a:schemeClr val="phClr"/>
+        </a:solidFill>
+        <a:solidFill>
+          <a:schemeClr val="phClr">
+            <a:tint val="95000"/>
+            <a:satMod val="170000"/>
+          </a:schemeClr>
+        </a:solidFill>
+        <a:gradFill rotWithShape="true">
+          <a:gsLst>
+            <a:gs pos="0">
+              <a:schemeClr val="phClr">
+                <a:tint val="93000"/>
+                <a:satMod val="150000"/>
+                <a:shade val="98000"/>
+                <a:lumMod val="102000"/>
+              </a:schemeClr>
+            </a:gs>
+            <a:gs pos="50000">
+              <a:schemeClr val="phClr">
+                <a:tint val="98000"/>
+                <a:satMod val="130000"/>
+                <a:shade val="90000"/>
+                <a:lumMod val="103000"/>
+              </a:schemeClr>
+            </a:gs>
+            <a:gs pos="100000">
+              <a:schemeClr val="phClr">
+                <a:shade val="63000"/>
+                <a:satMod val="120000"/>
+              </a:schemeClr>
+            </a:gs>
+          </a:gsLst>
+          <a:lin ang="5400000" scaled="false"/>
+        </a:gradFill>
+      </a:bgFillStyleLst>
+    </a:fmtScheme>
+  </a:themeElements>
+  <a:objectDefaults/>
+  <a:extraClrSchemeLst/>
+</a:theme>
 </file>
</xml_diff>

<commit_message>
feat: reframe hero and metadata around end-to-end Azure platform ownership
</commit_message>
<xml_diff>
--- a/resume/Colin-Shanahan-Resume.docx
+++ b/resume/Colin-Shanahan-Resume.docx
@@ -48,7 +48,7 @@
         </w:rPr>
         <w:t xml:space="preserve">Portfolio: </w:t>
       </w:r>
-      <w:hyperlink w:history="1" r:id="rId5e5bb2pimlvb1mzt--eh6">
+      <w:hyperlink w:history="1" r:id="rId19vnar2sutdcbbsnytuvi">
         <w:r>
           <w:rPr>
             <w:rFonts w:ascii="Calibri" w:cs="Calibri" w:eastAsia="Calibri" w:hAnsi="Calibri"/>
@@ -186,7 +186,7 @@
           <w:sz w:val="20"/>
           <w:szCs w:val="20"/>
         </w:rPr>
-        <w:t xml:space="preserve">DevOps Engineer / Cloud Architect (sole DevOps owner)</w:t>
+        <w:t xml:space="preserve">TODO(colin): confirm title (DevOps Engineer &amp; Cloud Architect?)</w:t>
       </w:r>
       <w:r>
         <w:rPr>
@@ -208,6 +208,49 @@
           <w:szCs w:val="20"/>
         </w:rPr>
         <w:t xml:space="preserve">Remote / Onsite</w:t>
+      </w:r>
+    </w:p>
+    <w:p>
+      <w:pPr>
+        <w:pStyle w:val="ListParagraph"/>
+        <w:numPr>
+          <w:ilvl w:val="0"/>
+          <w:numId w:val="2"/>
+        </w:numPr>
+        <w:spacing w:after="20" w:line="240"/>
+      </w:pPr>
+      <w:r>
+        <w:rPr>
+          <w:rFonts w:ascii="Calibri" w:cs="Calibri" w:eastAsia="Calibri" w:hAnsi="Calibri"/>
+          <w:b w:val="false"/>
+          <w:bCs w:val="false"/>
+          <w:color w:val="1A1A1A"/>
+          <w:sz w:val="19"/>
+          <w:szCs w:val="19"/>
+        </w:rPr>
+        <w:t xml:space="preserve">Served as </w:t>
+      </w:r>
+      <w:r>
+        <w:rPr>
+          <w:rFonts w:ascii="Calibri" w:cs="Calibri" w:eastAsia="Calibri" w:hAnsi="Calibri"/>
+          <w:b/>
+          <w:bCs/>
+          <w:color w:val="1A1A1A"/>
+          <w:sz w:val="19"/>
+          <w:szCs w:val="19"/>
+        </w:rPr>
+        <w:t xml:space="preserve">sole DevOps owner of the company's full Azure estate</w:t>
+      </w:r>
+      <w:r>
+        <w:rPr>
+          <w:rFonts w:ascii="Calibri" w:cs="Calibri" w:eastAsia="Calibri" w:hAnsi="Calibri"/>
+          <w:b w:val="false"/>
+          <w:bCs w:val="false"/>
+          <w:color w:val="1A1A1A"/>
+          <w:sz w:val="19"/>
+          <w:szCs w:val="19"/>
+        </w:rPr>
+        <w:t xml:space="preserve"> – CI/CD, IaC, security posture, and cost governance, end to end.</w:t>
       </w:r>
     </w:p>
     <w:p>

</xml_diff>

<commit_message>
Align hero eyebrow and terminal role with new title; rebuild resume DOCX
</commit_message>
<xml_diff>
--- a/resume/Colin-Shanahan-Resume.docx
+++ b/resume/Colin-Shanahan-Resume.docx
@@ -48,7 +48,7 @@
         </w:rPr>
         <w:t xml:space="preserve">Portfolio: </w:t>
       </w:r>
-      <w:hyperlink w:history="1" r:id="rId19vnar2sutdcbbsnytuvi">
+      <w:hyperlink w:history="1" r:id="rIdoropsmgq-5ttse3tunepz">
         <w:r>
           <w:rPr>
             <w:rFonts w:ascii="Calibri" w:cs="Calibri" w:eastAsia="Calibri" w:hAnsi="Calibri"/>
@@ -186,7 +186,7 @@
           <w:sz w:val="20"/>
           <w:szCs w:val="20"/>
         </w:rPr>
-        <w:t xml:space="preserve">TODO(colin): confirm title (DevOps Engineer &amp; Cloud Architect?)</w:t>
+        <w:t xml:space="preserve">DevOps Engineer, Cloud Infrastructure</w:t>
       </w:r>
       <w:r>
         <w:rPr>

</xml_diff>

<commit_message>
feat(content): give RDGFilings bullets measurable outcomes with TODO(colin) placeholders
- site/index.html, resume/resume-content.mjs (+ regenerated DOCX): lead each
  bullet with a figure from the case studies (~25 pipelines, -40% release
  cycles, SOC audits, no significant downtime); [TODO(colin): ...] elsewhere
- case-studies.js: replace 'pretty seamless migration' with a placeholder
- check-site.mjs: warn on TODO(colin) in PR branches, fail in --strict / on main;
  deploy.yml runs it strict before deploy and resume publish
- tests: one-line-at-1280 / mobile / format guards for the RDGFilings bullets
</commit_message>
<xml_diff>
--- a/resume/Colin-Shanahan-Resume.docx
+++ b/resume/Colin-Shanahan-Resume.docx
@@ -48,7 +48,7 @@
         </w:rPr>
         <w:t xml:space="preserve">Portfolio: </w:t>
       </w:r>
-      <w:hyperlink w:history="1" r:id="rIdoropsmgq-5ttse3tunepz">
+      <w:hyperlink w:history="1" r:id="rIdxx3vj5af0u0xauhyplaow">
         <w:r>
           <w:rPr>
             <w:rFonts w:ascii="Calibri" w:cs="Calibri" w:eastAsia="Calibri" w:hAnsi="Calibri"/>
@@ -250,7 +250,7 @@
           <w:sz w:val="19"/>
           <w:szCs w:val="19"/>
         </w:rPr>
-        <w:t xml:space="preserve"> – CI/CD, IaC, security posture, and cost governance, end to end.</w:t>
+        <w:t xml:space="preserve"> – [TODO(colin): # apps/environments] across CI/CD, IaC, security posture, and cost governance, end to end.</w:t>
       </w:r>
     </w:p>
     <w:p>
@@ -271,7 +271,7 @@
           <w:sz w:val="19"/>
           <w:szCs w:val="19"/>
         </w:rPr>
-        <w:t xml:space="preserve">Architected Azure DevOps CI/CD pipelines end-to-end, migrating legacy workflows from </w:t>
+        <w:t xml:space="preserve">Architected Azure DevOps CI/CD end-to-end, migrating ~25 pipelines (path-triggered YAML builds for a monorepo; classic releases with approvals and per-environment variable groups) off </w:t>
       </w:r>
       <w:r>
         <w:rPr>
@@ -293,7 +293,7 @@
           <w:sz w:val="19"/>
           <w:szCs w:val="19"/>
         </w:rPr>
-        <w:t xml:space="preserve"> and Jenkins to Azure DevOps, reducing release cycles by 40% and improving deployment reliability.</w:t>
+        <w:t xml:space="preserve"> and Jenkins – release cycles down 40%, deployment reliability up.</w:t>
       </w:r>
     </w:p>
     <w:p>
@@ -314,29 +314,7 @@
           <w:sz w:val="19"/>
           <w:szCs w:val="19"/>
         </w:rPr>
-        <w:t xml:space="preserve">Authored </w:t>
-      </w:r>
-      <w:r>
-        <w:rPr>
-          <w:rFonts w:ascii="Calibri" w:cs="Calibri" w:eastAsia="Calibri" w:hAnsi="Calibri"/>
-          <w:b/>
-          <w:bCs/>
-          <w:color w:val="1A1A1A"/>
-          <w:sz w:val="19"/>
-          <w:szCs w:val="19"/>
-        </w:rPr>
-        <w:t xml:space="preserve">Terraform</w:t>
-      </w:r>
-      <w:r>
-        <w:rPr>
-          <w:rFonts w:ascii="Calibri" w:cs="Calibri" w:eastAsia="Calibri" w:hAnsi="Calibri"/>
-          <w:b w:val="false"/>
-          <w:bCs w:val="false"/>
-          <w:color w:val="1A1A1A"/>
-          <w:sz w:val="19"/>
-          <w:szCs w:val="19"/>
-        </w:rPr>
-        <w:t xml:space="preserve"> IaC to automate provisioning of Container Apps, Function Apps, VMs, Key Vault, and networking, replacing GCP-based systems with consistent, repeatable Azure deployments.</w:t>
+        <w:t xml:space="preserve">Built the approval gates and audit trail that helped the company complete its SOC audits; avoided the Octopus Deploy renewal ([TODO(colin): license savings, relative % only]).</w:t>
       </w:r>
     </w:p>
     <w:p>
@@ -357,29 +335,29 @@
           <w:sz w:val="19"/>
           <w:szCs w:val="19"/>
         </w:rPr>
-        <w:t xml:space="preserve">Implemented </w:t>
-      </w:r>
-      <w:r>
-        <w:rPr>
-          <w:rFonts w:ascii="Calibri" w:cs="Calibri" w:eastAsia="Calibri" w:hAnsi="Calibri"/>
-          <w:b/>
-          <w:bCs/>
-          <w:color w:val="1A1A1A"/>
-          <w:sz w:val="19"/>
-          <w:szCs w:val="19"/>
-        </w:rPr>
-        <w:t xml:space="preserve">OIDC / workload identity federation</w:t>
-      </w:r>
-      <w:r>
-        <w:rPr>
-          <w:rFonts w:ascii="Calibri" w:cs="Calibri" w:eastAsia="Calibri" w:hAnsi="Calibri"/>
-          <w:b w:val="false"/>
-          <w:bCs w:val="false"/>
-          <w:color w:val="1A1A1A"/>
-          <w:sz w:val="19"/>
-          <w:szCs w:val="19"/>
-        </w:rPr>
-        <w:t xml:space="preserve"> for all pipeline authentication, eliminating stored credentials and long-lived secrets from CI/CD and improving audit posture.</w:t>
+        <w:t xml:space="preserve">Authored </w:t>
+      </w:r>
+      <w:r>
+        <w:rPr>
+          <w:rFonts w:ascii="Calibri" w:cs="Calibri" w:eastAsia="Calibri" w:hAnsi="Calibri"/>
+          <w:b/>
+          <w:bCs/>
+          <w:color w:val="1A1A1A"/>
+          <w:sz w:val="19"/>
+          <w:szCs w:val="19"/>
+        </w:rPr>
+        <w:t xml:space="preserve">Terraform</w:t>
+      </w:r>
+      <w:r>
+        <w:rPr>
+          <w:rFonts w:ascii="Calibri" w:cs="Calibri" w:eastAsia="Calibri" w:hAnsi="Calibri"/>
+          <w:b w:val="false"/>
+          <w:bCs w:val="false"/>
+          <w:color w:val="1A1A1A"/>
+          <w:sz w:val="19"/>
+          <w:szCs w:val="19"/>
+        </w:rPr>
+        <w:t xml:space="preserve"> IaC for Container Apps, Function Apps, VMs, Key Vault, and networking, replacing hand-built GCP systems and cutting over to Azure in stages – no significant downtime on main sites ([TODO(colin): downtime during cutover]); environments rebuild from code.</w:t>
       </w:r>
     </w:p>
     <w:p>
@@ -400,6 +378,49 @@
           <w:sz w:val="19"/>
           <w:szCs w:val="19"/>
         </w:rPr>
+        <w:t xml:space="preserve">Implemented </w:t>
+      </w:r>
+      <w:r>
+        <w:rPr>
+          <w:rFonts w:ascii="Calibri" w:cs="Calibri" w:eastAsia="Calibri" w:hAnsi="Calibri"/>
+          <w:b/>
+          <w:bCs/>
+          <w:color w:val="1A1A1A"/>
+          <w:sz w:val="19"/>
+          <w:szCs w:val="19"/>
+        </w:rPr>
+        <w:t xml:space="preserve">OIDC / workload identity federation</w:t>
+      </w:r>
+      <w:r>
+        <w:rPr>
+          <w:rFonts w:ascii="Calibri" w:cs="Calibri" w:eastAsia="Calibri" w:hAnsi="Calibri"/>
+          <w:b w:val="false"/>
+          <w:bCs w:val="false"/>
+          <w:color w:val="1A1A1A"/>
+          <w:sz w:val="19"/>
+          <w:szCs w:val="19"/>
+        </w:rPr>
+        <w:t xml:space="preserve"> for all pipeline authentication, eliminating stored credentials and long-lived secrets from CI/CD and improving audit posture.</w:t>
+      </w:r>
+    </w:p>
+    <w:p>
+      <w:pPr>
+        <w:pStyle w:val="ListParagraph"/>
+        <w:numPr>
+          <w:ilvl w:val="0"/>
+          <w:numId w:val="2"/>
+        </w:numPr>
+        <w:spacing w:after="20" w:line="240"/>
+      </w:pPr>
+      <w:r>
+        <w:rPr>
+          <w:rFonts w:ascii="Calibri" w:cs="Calibri" w:eastAsia="Calibri" w:hAnsi="Calibri"/>
+          <w:b w:val="false"/>
+          <w:bCs w:val="false"/>
+          <w:color w:val="1A1A1A"/>
+          <w:sz w:val="19"/>
+          <w:szCs w:val="19"/>
+        </w:rPr>
         <w:t xml:space="preserve">Modernized a legacy </w:t>
       </w:r>
       <w:r>
@@ -488,7 +509,7 @@
           <w:sz w:val="19"/>
           <w:szCs w:val="19"/>
         </w:rPr>
-        <w:t xml:space="preserve"> with zero public data-plane exposure.</w:t>
+        <w:t xml:space="preserve"> with zero public data-plane exposure, serving [TODO(colin): # users/clients].</w:t>
       </w:r>
     </w:p>
     <w:p>

</xml_diff>